<commit_message>
feat(weekly): include SharePoint link in report email body
Capture the upload URL and inject it as a clickable link at the top of
the weekly email on successful upload; keep the red warning banner as the
fallback when upload fails. Includes the published WW31 report.

Co-authored-by: Copilot <223556219+Copilot@users.noreply.github.com>
</commit_message>
<xml_diff>
--- a/weekly_reports/WW31-JohnMonroe-Weekly.docx
+++ b/weekly_reports/WW31-JohnMonroe-Weekly.docx
@@ -43,6 +43,86 @@
         <w:pStyle w:val="ListBullet"/>
       </w:pPr>
       <w:r>
+        <w:t>IRE Dashboard - 7 change(s) this week:</w:t>
+      </w:r>
+    </w:p>
+    <w:p>
+      <w:pPr>
+        <w:pStyle w:val="ListBullet2"/>
+      </w:pPr>
+      <w:r>
+        <w:t>- feat(ire-sla, ire-observability): SLA API expansion, DT topology providers (2026-07-28)</w:t>
+      </w:r>
+    </w:p>
+    <w:p>
+      <w:pPr>
+        <w:pStyle w:val="ListBullet2"/>
+      </w:pPr>
+      <w:r>
+        <w:t>- docs(ops): README, ADR-0003, data sources, env config, ops scripts (2026-07-28)</w:t>
+      </w:r>
+    </w:p>
+    <w:p>
+      <w:pPr>
+        <w:pStyle w:val="ListBullet2"/>
+      </w:pPr>
+      <w:r>
+        <w:t>- feat(ui): page enhancements - signal readiness, CMDB quality, risk register, network, docs (2026-07-28)</w:t>
+      </w:r>
+    </w:p>
+    <w:p>
+      <w:pPr>
+        <w:pStyle w:val="ListBullet2"/>
+      </w:pPr>
+      <w:r>
+        <w:t>- feat(core): server, schema, ITSM/CMDB clients, RCA deep dive, risk/change data (2026-07-28)</w:t>
+      </w:r>
+    </w:p>
+    <w:p>
+      <w:pPr>
+        <w:pStyle w:val="ListBullet2"/>
+      </w:pPr>
+      <w:r>
+        <w:t>- feat(ui): add AppShowback, MajorIncidents, AgenticArchitecture pages; shared nav (2026-07-28)</w:t>
+      </w:r>
+    </w:p>
+    <w:p>
+      <w:pPr>
+        <w:pStyle w:val="ListBullet2"/>
+      </w:pPr>
+      <w:r>
+        <w:t>- feat(cmdb): rebuild v_cmdb_rel_flat from apigee_cmdb_rel_ci; full backfill scripts (2026-07-28)</w:t>
+      </w:r>
+    </w:p>
+    <w:p>
+      <w:pPr>
+        <w:pStyle w:val="ListBullet2"/>
+      </w:pPr>
+      <w:r>
+        <w:t>- feat(ask-ire-data): model selection, IAP column injection, CMDB host fix, result limit increase (2026-07-28)</w:t>
+      </w:r>
+    </w:p>
+    <w:p>
+      <w:pPr>
+        <w:pStyle w:val="ListBullet"/>
+      </w:pPr>
+      <w:r>
+        <w:t>IRE-AutomateProject - 1 change(s) this week:</w:t>
+      </w:r>
+    </w:p>
+    <w:p>
+      <w:pPr>
+        <w:pStyle w:val="ListBullet2"/>
+      </w:pPr>
+      <w:r>
+        <w:t>- Initial commit: IRE PowerAutomate / weekly-report toolkit (2026-07-28)</w:t>
+      </w:r>
+    </w:p>
+    <w:p>
+      <w:pPr>
+        <w:pStyle w:val="ListBullet"/>
+      </w:pPr>
+      <w:r>
         <w:t>IRE-python-template - 1 change(s) this week:</w:t>
       </w:r>
     </w:p>
@@ -52,6 +132,22 @@
       </w:pPr>
       <w:r>
         <w:t>- docs(crg): document opt-in semantic-search embeddings step (2026-07-28)</w:t>
+      </w:r>
+    </w:p>
+    <w:p>
+      <w:pPr>
+        <w:pStyle w:val="ListBullet"/>
+      </w:pPr>
+      <w:r>
+        <w:t>skills_analysis - 1 change(s) this week:</w:t>
+      </w:r>
+    </w:p>
+    <w:p>
+      <w:pPr>
+        <w:pStyle w:val="ListBullet2"/>
+      </w:pPr>
+      <w:r>
+        <w:t>- Initial commit: IRE skills analysis + AI journey docs (2026-07-28)</w:t>
       </w:r>
     </w:p>
     <w:p/>

</xml_diff>

<commit_message>
report(WW31): generate weekly with email + calendar sources
WW31 status report (84 items, 14 sources, 0 warnings): git changes across
IRE Dashboard/skills_analysis (AI Journey v1.51)/IRE-python-template CRG CI/
crg-mcp-service, 30 Outlook meetings (COM), and 25 relevant emails. Uploaded to
SharePoint weeklies and emailed.

Co-authored-by: Copilot <223556219+Copilot@users.noreply.github.com>
</commit_message>
<xml_diff>
--- a/weekly_reports/WW31-JohnMonroe-Weekly.docx
+++ b/weekly_reports/WW31-JohnMonroe-Weekly.docx
@@ -43,7 +43,55 @@
         <w:pStyle w:val="ListBullet"/>
       </w:pPr>
       <w:r>
-        <w:t>IRE Dashboard - 7 change(s) this week:</w:t>
+        <w:t>IRE Dashboard - 13 change(s) this week:</w:t>
+      </w:r>
+    </w:p>
+    <w:p>
+      <w:pPr>
+        <w:pStyle w:val="ListBullet2"/>
+      </w:pPr>
+      <w:r>
+        <w:t>- feat(askiredata): show only working models across providers in picker (2026-07-29)</w:t>
+      </w:r>
+    </w:p>
+    <w:p>
+      <w:pPr>
+        <w:pStyle w:val="ListBullet2"/>
+      </w:pPr>
+      <w:r>
+        <w:t>- feat(askiredata): replace opus 4.8 with gpt-5.5 model option (2026-07-29)</w:t>
+      </w:r>
+    </w:p>
+    <w:p>
+      <w:pPr>
+        <w:pStyle w:val="ListBullet2"/>
+      </w:pPr>
+      <w:r>
+        <w:t>- refactor(ui): add prominent section headers to discovery tables (2026-07-29)</w:t>
+      </w:r>
+    </w:p>
+    <w:p>
+      <w:pPr>
+        <w:pStyle w:val="ListBullet2"/>
+      </w:pPr>
+      <w:r>
+        <w:t>- refactor(ui): stack discovery tables vertically instead of side-by-side (2026-07-29)</w:t>
+      </w:r>
+    </w:p>
+    <w:p>
+      <w:pPr>
+        <w:pStyle w:val="ListBullet2"/>
+      </w:pPr>
+      <w:r>
+        <w:t>- feat(catalog): add description column to discovery catalog with hover tooltip (2026-07-28)</w:t>
+      </w:r>
+    </w:p>
+    <w:p>
+      <w:pPr>
+        <w:pStyle w:val="ListBullet2"/>
+      </w:pPr>
+      <w:r>
+        <w:t>- docs(guide): update CopilotAPIGuide for 2026-07-28 changes; fix CMDB query fallback (2026-07-28)</w:t>
       </w:r>
     </w:p>
     <w:p>
@@ -99,7 +147,7 @@
         <w:pStyle w:val="ListBullet2"/>
       </w:pPr>
       <w:r>
-        <w:t>- feat(ask-ire-data): model selection, IAP column injection, CMDB host fix, result limit increase (2026-07-28)</w:t>
+        <w:t>- ...and 1 more</w:t>
       </w:r>
     </w:p>
     <w:p>
@@ -107,7 +155,63 @@
         <w:pStyle w:val="ListBullet"/>
       </w:pPr>
       <w:r>
-        <w:t>IRE-AutomateProject - 1 change(s) this week:</w:t>
+        <w:t>crg-mcp-service - 2 change(s) this week:</w:t>
+      </w:r>
+    </w:p>
+    <w:p>
+      <w:pPr>
+        <w:pStyle w:val="ListBullet2"/>
+      </w:pPr>
+      <w:r>
+        <w:t>- docs: add Phase-2 execution backlog (2026-07-29)</w:t>
+      </w:r>
+    </w:p>
+    <w:p>
+      <w:pPr>
+        <w:pStyle w:val="ListBullet2"/>
+      </w:pPr>
+      <w:r>
+        <w:t>- Initial commit: hosted CRG MCP service for Intel MCP Registry (2026-07-29)</w:t>
+      </w:r>
+    </w:p>
+    <w:p>
+      <w:pPr>
+        <w:pStyle w:val="ListBullet"/>
+      </w:pPr>
+      <w:r>
+        <w:t>IRE-AutomateProject - 5 change(s) this week:</w:t>
+      </w:r>
+    </w:p>
+    <w:p>
+      <w:pPr>
+        <w:pStyle w:val="ListBullet2"/>
+      </w:pPr>
+      <w:r>
+        <w:t>- feat(weekly): add non-Graph Outlook calendar/meeting scanning via COM (2026-07-29)</w:t>
+      </w:r>
+    </w:p>
+    <w:p>
+      <w:pPr>
+        <w:pStyle w:val="ListBullet2"/>
+      </w:pPr>
+      <w:r>
+        <w:t>- feat(weekly): add Outlook email scanning to weekly status report (2026-07-29)</w:t>
+      </w:r>
+    </w:p>
+    <w:p>
+      <w:pPr>
+        <w:pStyle w:val="ListBullet2"/>
+      </w:pPr>
+      <w:r>
+        <w:t>- docs(m365): add Weekly Summary Writer agent SharePoint-publish integration (2026-07-28)</w:t>
+      </w:r>
+    </w:p>
+    <w:p>
+      <w:pPr>
+        <w:pStyle w:val="ListBullet2"/>
+      </w:pPr>
+      <w:r>
+        <w:t>- feat(weekly): include SharePoint link in report email body (2026-07-28)</w:t>
       </w:r>
     </w:p>
     <w:p>
@@ -123,7 +227,7 @@
         <w:pStyle w:val="ListBullet"/>
       </w:pPr>
       <w:r>
-        <w:t>IRE-python-template - 1 change(s) this week:</w:t>
+        <w:t>IRE-python-template - 2 change(s) this week:</w:t>
       </w:r>
     </w:p>
     <w:p>
@@ -131,7 +235,15 @@
         <w:pStyle w:val="ListBullet2"/>
       </w:pPr>
       <w:r>
-        <w:t>- docs(crg): document opt-in semantic-search embeddings step (2026-07-28)</w:t>
+        <w:t>- ci: replace blocked CRG third-party action with pinned pip install (#2) (2026-07-29)</w:t>
+      </w:r>
+    </w:p>
+    <w:p>
+      <w:pPr>
+        <w:pStyle w:val="ListBullet2"/>
+      </w:pPr>
+      <w:r>
+        <w:t>- skills: add continuous-learning-teach (governed Teach control plane) + identity/prompt-security callouts (#1) (2026-07-29)</w:t>
       </w:r>
     </w:p>
     <w:p>
@@ -139,7 +251,55 @@
         <w:pStyle w:val="ListBullet"/>
       </w:pPr>
       <w:r>
-        <w:t>skills_analysis - 1 change(s) this week:</w:t>
+        <w:t>skills_analysis - 7 change(s) this week:</w:t>
+      </w:r>
+    </w:p>
+    <w:p>
+      <w:pPr>
+        <w:pStyle w:val="ListBullet2"/>
+      </w:pPr>
+      <w:r>
+        <w:t>- journey: add v1.51 master - new S15 production hosting, durability &amp; portable guardrails (2026-07-29)</w:t>
+      </w:r>
+    </w:p>
+    <w:p>
+      <w:pPr>
+        <w:pStyle w:val="ListBullet2"/>
+      </w:pPr>
+      <w:r>
+        <w:t>- journey(public): sync public doc v1.46 -&gt; v1.50 (2026-07-29)</w:t>
+      </w:r>
+    </w:p>
+    <w:p>
+      <w:pPr>
+        <w:pStyle w:val="ListBullet2"/>
+      </w:pPr>
+      <w:r>
+        <w:t>- chore: archive AI_Enabled_Journey_v1.49.docx (2026-07-29)</w:t>
+      </w:r>
+    </w:p>
+    <w:p>
+      <w:pPr>
+        <w:pStyle w:val="ListBullet2"/>
+      </w:pPr>
+      <w:r>
+        <w:t>- journey: v1.50 - From Guardrails to Governed Learning (attrib. K. Harris) (2026-07-29)</w:t>
+      </w:r>
+    </w:p>
+    <w:p>
+      <w:pPr>
+        <w:pStyle w:val="ListBullet2"/>
+      </w:pPr>
+      <w:r>
+        <w:t>- journey: v1.49 - add 'Barriers to Adoption' to Conclusion (2026-07-29)</w:t>
+      </w:r>
+    </w:p>
+    <w:p>
+      <w:pPr>
+        <w:pStyle w:val="ListBullet2"/>
+      </w:pPr>
+      <w:r>
+        <w:t>- journey: v1.48 - add ISO/IEC 42001:2023 AIMS study to JHU track (2026-07-28)</w:t>
       </w:r>
     </w:p>
     <w:p>
@@ -148,6 +308,318 @@
       </w:pPr>
       <w:r>
         <w:t>- Initial commit: IRE skills analysis + AI journey docs (2026-07-28)</w:t>
+      </w:r>
+    </w:p>
+    <w:p>
+      <w:pPr>
+        <w:pStyle w:val="ListBullet"/>
+      </w:pPr>
+      <w:r>
+        <w:t>Meetings this week (30):</w:t>
+      </w:r>
+    </w:p>
+    <w:p>
+      <w:pPr>
+        <w:pStyle w:val="ListBullet2"/>
+      </w:pPr>
+      <w:r>
+        <w:t>- Review  network IRE Resiliency slides for Network Engineering - Belvadi, Santhosh @ Microsoft Teams Meeting (2026-07-27)</w:t>
+      </w:r>
+    </w:p>
+    <w:p>
+      <w:pPr>
+        <w:pStyle w:val="ListBullet2"/>
+      </w:pPr>
+      <w:r>
+        <w:t>- IRE - Team Connect Session- Weekly - Belvadi, Santhosh @ Microsoft Teams Meeting (2026-07-27)</w:t>
+      </w:r>
+    </w:p>
+    <w:p>
+      <w:pPr>
+        <w:pStyle w:val="ListBullet2"/>
+      </w:pPr>
+      <w:r>
+        <w:t>- Intel Company Meeting - Employee Communications @ Live webcast (link below) (2026-07-27)</w:t>
+      </w:r>
+    </w:p>
+    <w:p>
+      <w:pPr>
+        <w:pStyle w:val="ListBullet2"/>
+      </w:pPr>
+      <w:r>
+        <w:t>- Intel working session - Trevor Evenson (2026-07-27)</w:t>
+      </w:r>
+    </w:p>
+    <w:p>
+      <w:pPr>
+        <w:pStyle w:val="ListBullet2"/>
+      </w:pPr>
+      <w:r>
+        <w:t>- IAPM &amp; SNOW link questions - Webster, Amy C @ Microsoft Teams Meeting (2026-07-27)</w:t>
+      </w:r>
+    </w:p>
+    <w:p>
+      <w:pPr>
+        <w:pStyle w:val="ListBullet2"/>
+      </w:pPr>
+      <w:r>
+        <w:t>- Silicon Forest Karate 5:30pm Monday - Rice, Ritchie @ Zoom or Park (2026-07-27)</w:t>
+      </w:r>
+    </w:p>
+    <w:p>
+      <w:pPr>
+        <w:pStyle w:val="ListBullet2"/>
+      </w:pPr>
+      <w:r>
+        <w:t>- Weekly Major Problem Review (MPR) – RCA Readiness &amp; Documentation Completion - Agrawal, Rakesh Kumar @ Microsoft Teams Meeting (2026-07-28)</w:t>
+      </w:r>
+    </w:p>
+    <w:p>
+      <w:pPr>
+        <w:pStyle w:val="ListBullet2"/>
+      </w:pPr>
+      <w:r>
+        <w:t>- 1:1 - - Monroe, John @ Microsoft Teams Meeting (2026-07-28)</w:t>
+      </w:r>
+    </w:p>
+    <w:p>
+      <w:pPr>
+        <w:pStyle w:val="ListBullet2"/>
+      </w:pPr>
+      <w:r>
+        <w:t>- AL AI - Gregory, Mark F @ Microsoft Teams Meeting (2026-07-28)</w:t>
+      </w:r>
+    </w:p>
+    <w:p>
+      <w:pPr>
+        <w:pStyle w:val="ListBullet2"/>
+      </w:pPr>
+      <w:r>
+        <w:t>- 1:1 - Webster, Amy C @ Microsoft Teams Meeting (2026-07-28)</w:t>
+      </w:r>
+    </w:p>
+    <w:p>
+      <w:pPr>
+        <w:pStyle w:val="ListBullet2"/>
+      </w:pPr>
+      <w:r>
+        <w:t>- Silicon Forest Karate Class Tuesday JF2 FC 5:30pmpm - Rice, Ritchie @ JF2 FC (2026-07-28)</w:t>
+      </w:r>
+    </w:p>
+    <w:p>
+      <w:pPr>
+        <w:pStyle w:val="ListBullet2"/>
+      </w:pPr>
+      <w:r>
+        <w:t>- Hawthorn Farm Data Centers Shutdown - Sync up meeting - Schmidt, Harry @ Microsoft Teams Meeting (2026-07-28)</w:t>
+      </w:r>
+    </w:p>
+    <w:p>
+      <w:pPr>
+        <w:pStyle w:val="ListBullet2"/>
+      </w:pPr>
+      <w:r>
+        <w:t>- Intel + BigPanda Bi-Weekly Sync - Aiden Kahn (2026-07-29)</w:t>
+      </w:r>
+    </w:p>
+    <w:p>
+      <w:pPr>
+        <w:pStyle w:val="ListBullet2"/>
+      </w:pPr>
+      <w:r>
+        <w:t>- karate - Suto, Gyuszi @ zoom (2026-07-29)</w:t>
+      </w:r>
+    </w:p>
+    <w:p>
+      <w:pPr>
+        <w:pStyle w:val="ListBullet2"/>
+      </w:pPr>
+      <w:r>
+        <w:t>- 1:1 John/Sergio - Sanchez Ramos, Sergio @ Microsoft Teams Meeting (2026-07-29)</w:t>
+      </w:r>
+    </w:p>
+    <w:p>
+      <w:pPr>
+        <w:pStyle w:val="ListBullet2"/>
+      </w:pPr>
+      <w:r>
+        <w:t>- BigPanda + Intel sync - Aiden Kahn (2026-07-30)</w:t>
+      </w:r>
+    </w:p>
+    <w:p>
+      <w:pPr>
+        <w:pStyle w:val="ListBullet2"/>
+      </w:pPr>
+      <w:r>
+        <w:t>- karate - Suto, Gyuszi @ zoom (2026-07-30)</w:t>
+      </w:r>
+    </w:p>
+    <w:p>
+      <w:pPr>
+        <w:pStyle w:val="ListBullet2"/>
+      </w:pPr>
+      <w:r>
+        <w:t>- Silicon Forest Karate Class Friday JF2 FC noon - Rice, Ritchie @ JF2 FC (2026-07-31)</w:t>
+      </w:r>
+    </w:p>
+    <w:p>
+      <w:pPr>
+        <w:pStyle w:val="ListBullet2"/>
+      </w:pPr>
+      <w:r>
+        <w:t>- Refresh ISMP/ServiceNow Preview, Test - McKain, Mark @ Save your work!!! (2026-08-01)</w:t>
+      </w:r>
+    </w:p>
+    <w:p>
+      <w:pPr>
+        <w:pStyle w:val="ListBullet2"/>
+      </w:pPr>
+      <w:r>
+        <w:t>- Refresh ISMP/ServiceNow sandbox 106 - McKain, Mark @ Save your work!!! (2026-08-02)</w:t>
+      </w:r>
+    </w:p>
+    <w:p>
+      <w:pPr>
+        <w:pStyle w:val="ListBullet2"/>
+      </w:pPr>
+      <w:r>
+        <w:t>- ...and 10 more</w:t>
+      </w:r>
+    </w:p>
+    <w:p>
+      <w:pPr>
+        <w:pStyle w:val="ListBullet"/>
+      </w:pPr>
+      <w:r>
+        <w:t>Relevant email activity this week (25):</w:t>
+      </w:r>
+    </w:p>
+    <w:p>
+      <w:pPr>
+        <w:pStyle w:val="ListBullet2"/>
+      </w:pPr>
+      <w:r>
+        <w:t>- [Inbox] Intel + BigPanda Bi-Weekly Sync Follow-Up - jmantri@bigpanda.io (2026-07-29)</w:t>
+      </w:r>
+    </w:p>
+    <w:p>
+      <w:pPr>
+        <w:pStyle w:val="ListBullet2"/>
+      </w:pPr>
+      <w:r>
+        <w:t>- [Inbox] IRE Sergio Analytics - Session Summary 2026-07-29 - sergio.sanchez.ramos@intel.com (2026-07-29)</w:t>
+      </w:r>
+    </w:p>
+    <w:p>
+      <w:pPr>
+        <w:pStyle w:val="ListBullet2"/>
+      </w:pPr>
+      <w:r>
+        <w:t>- [Inbox] 📢 Smartsheet Work Insights Retirement – Action Required... - notifications_intel@engage.mail.microsoft (2026-07-29)</w:t>
+      </w:r>
+    </w:p>
+    <w:p>
+      <w:pPr>
+        <w:pStyle w:val="ListBullet2"/>
+      </w:pPr>
+      <w:r>
+        <w:t>- [Inbox] JHU Master Class Update!: JHU_Applied_Generative_AI&amp;Agentic_AI_May_A Masterclass - no-reply@mygreatlearning.com (2026-07-29)</w:t>
+      </w:r>
+    </w:p>
+    <w:p>
+      <w:pPr>
+        <w:pStyle w:val="ListBullet2"/>
+      </w:pPr>
+      <w:r>
+        <w:t>- [Inbox] Path to Production Agentic  Durability - kyle.r.harris@intel.com (2026-07-29)</w:t>
+      </w:r>
+    </w:p>
+    <w:p>
+      <w:pPr>
+        <w:pStyle w:val="ListBullet2"/>
+      </w:pPr>
+      <w:r>
+        <w:t>- [Inbox] Recovered: P1 - Critical Major Incident: INC15671847 - IDC9 impacted due to Firewall Change - It.support.and.services.cloud@intel.com (2026-07-29)</w:t>
+      </w:r>
+    </w:p>
+    <w:p>
+      <w:pPr>
+        <w:pStyle w:val="ListBullet2"/>
+      </w:pPr>
+      <w:r>
+        <w:t>- [Inbox] 📢 Smartsheet Update: Card View Retirement – Action... - notifications_intel@engage.mail.microsoft (2026-07-29)</w:t>
+      </w:r>
+    </w:p>
+    <w:p>
+      <w:pPr>
+        <w:pStyle w:val="ListBullet2"/>
+      </w:pPr>
+      <w:r>
+        <w:t>- [Inbox] [intel-innersource/applications.services.resiliency.ire-python-template] PR run failed at startup: CRG PR Review (optional) - skills: add continuous-learning-teach (governed Teach control plane) + identity/prompt-security callouts (c620238) - notifications@github.com (2026-07-29)</w:t>
+      </w:r>
+    </w:p>
+    <w:p>
+      <w:pPr>
+        <w:pStyle w:val="ListBullet2"/>
+      </w:pPr>
+      <w:r>
+        <w:t>- [Inbox] [intel-innersource/applications.services.resiliency.ire-python-template] PR run failed at startup: CRG PR Review (optional) - skills: add continuous-learning-teach (governed Teach control plane) + identity/prompt-security callouts (44f91bf) - notifications@github.com (2026-07-29)</w:t>
+      </w:r>
+    </w:p>
+    <w:p>
+      <w:pPr>
+        <w:pStyle w:val="ListBullet2"/>
+      </w:pPr>
+      <w:r>
+        <w:t>- [Inbox] Backlog Update 8 - Kudo's for Teach and Learn - kyle.r.harris@intel.com (2026-07-29)</w:t>
+      </w:r>
+    </w:p>
+    <w:p>
+      <w:pPr>
+        <w:pStyle w:val="ListBullet2"/>
+      </w:pPr>
+      <w:r>
+        <w:t>- [Inbox] Backlog Update 7 - Teach and Learn - kyle.r.harris@intel.com (2026-07-29)</w:t>
+      </w:r>
+    </w:p>
+    <w:p>
+      <w:pPr>
+        <w:pStyle w:val="ListBullet2"/>
+      </w:pPr>
+      <w:r>
+        <w:t>- [Inbox] [AI Dashboards] Backup &amp; Recovery — Daily Status — 100.0% execution health (24h) - igpt_iaas_rpts@intel.com (2026-07-29)</w:t>
+      </w:r>
+    </w:p>
+    <w:p>
+      <w:pPr>
+        <w:pStyle w:val="ListBullet2"/>
+      </w:pPr>
+      <w:r>
+        <w:t>- [Inbox] Find New Deals in Your Weekly Ad 🤩 | Same Points, More Choices | Earn 4X Points - email@e.fredmeyermail.com (2026-07-29)</w:t>
+      </w:r>
+    </w:p>
+    <w:p>
+      <w:pPr>
+        <w:pStyle w:val="ListBullet2"/>
+      </w:pPr>
+      <w:r>
+        <w:t>- [Sent Items] RE: IRE Sergio Analytics - Session Summary 2026-07-29 - john.monroe@intel.com (2026-07-30)</w:t>
+      </w:r>
+    </w:p>
+    <w:p>
+      <w:pPr>
+        <w:pStyle w:val="ListBullet2"/>
+      </w:pPr>
+      <w:r>
+        <w:t>- [Sent Items] RE: BigPanda resiliency conversation - john.monroe@intel.com (2026-07-29)</w:t>
+      </w:r>
+    </w:p>
+    <w:p>
+      <w:pPr>
+        <w:pStyle w:val="ListBullet2"/>
+      </w:pPr>
+      <w:r>
+        <w:t>- ...and 10 more</w:t>
       </w:r>
     </w:p>
     <w:p/>

</xml_diff>